<commit_message>
Complete prose constraint audit — eliminate all repetitive patterns across all 5 briefings
B02 p5: break consecutive "Decision Intelligence / Decision Governance" starts — restructure to "For Decision Governance, the question is..."
B03 p9: "A bank can" → "Banks can" to break consecutive "A [noun]" starts
B05 p2: replace four-item "[a noun] [verb]s" colon list with natural prose — no enumeration
B05 p11: "Which authority holder" → "Who holds authority" to break consecutive "Which" question starts
B05 p12: "A control layer" → "The control layer" to break consecutive "A [noun]" starts

Automated audit confirms all five briefings clean: no em dashes, no forbidden sentence starters, no repetitive consecutive patterns.

Co-Authored-By: Claude Sonnet 4.6 <noreply@anthropic.com>
</commit_message>
<xml_diff>
--- a/briefings-source/Strategic_Intelligence_Briefing_05.docx
+++ b/briefings-source/Strategic_Intelligence_Briefing_05.docx
@@ -286,7 +286,7 @@
           <w:rFonts w:ascii="Aptos" w:hAnsi="Aptos"/>
           <w:b/>
         </w:rPr>
-        <w:t>Enterprises are moving AI generated output into real work faster than their control models can absorb. Output moves quickly: a summary becomes a recommendation, a recommendation becomes a routing decision, a risk classification changes review priority, a draft influences a legal, financial, operational, customer, or employee outcome. The dangerous assumption is that output remains harmless until a system executes an action on its own. The stronger enterprise view is that AI output becomes control relevant the moment it begins shaping the path toward execution.</w:t>
+        <w:t>Enterprises are moving AI generated output into real work faster than their control models can absorb. AI output becomes consequential long before any automated action occurs. The moment a summary shapes how a decision is framed, or a risk classification changes who receives review, output has already entered the decision path. The dangerous assumption is that output remains harmless until a system executes an action on its own. The stronger enterprise view is that AI output becomes control relevant the moment it begins shaping the path toward execution.</w:t>
       </w:r>
     </w:p>
     <w:p>
@@ -471,7 +471,7 @@
         <w:rPr>
           <w:rFonts w:ascii="Aptos" w:hAnsi="Aptos"/>
         </w:rPr>
-        <w:t>The layer between output and execution should answer operational questions that policy alone cannot answer in real time. What type of work did AI produce? Which decision could it affect? What consequence level is attached to that decision? Which authority holder owns the next step? Which trigger condition applies? Is review mandatory? Can the action continue automatically? Does an override require a reason code? What evidence must be preserved before the workflow moves forward?</w:t>
+        <w:t>The layer between output and execution should answer operational questions that policy alone cannot answer in real time. What type of work did AI produce? Which decision could it affect? What consequence level is attached to that decision? Who holds authority over the next step? Which trigger condition applies? Is review mandatory? Can the action continue automatically? Does an override require a reason code? What evidence must be preserved before the workflow moves forward?</w:t>
       </w:r>
     </w:p>
     <w:p>
@@ -482,7 +482,7 @@
         <w:rPr>
           <w:rFonts w:ascii="Aptos" w:hAnsi="Aptos"/>
         </w:rPr>
-        <w:t>Those questions belong inside the operating path, not in a quarterly governance review. A quarterly review may find patterns after the fact. A control layer acts at the point where the institution still has the ability to stop, redirect, escalate, or authorize the action. The closer the control sits to execution, the more useful it becomes for preventing unauthorized consequence rather than merely explaining it later.</w:t>
+        <w:t>Those questions belong inside the operating path, not in a quarterly governance review. A quarterly review may find patterns after the fact. The control layer acts at the point where the institution still has the ability to stop, redirect, escalate, or authorize the action. The closer the control sits to execution, the more useful it becomes for preventing unauthorized consequence rather than merely explaining it later.</w:t>
       </w:r>
     </w:p>
     <w:p>

</xml_diff>